<commit_message>
Add get-job.skill pipeline for Guolian Minsheng quant role.
Produce job research, a JD-aligned resume, and interview prep
without fabricating ML, Tick, or index-enhancement product experience.

Co-authored-by: invy95 <invy95@users.noreply.github.com>
</commit_message>
<xml_diff>
--- a/resume/殷维_国联民生_量化研究员简历.docx
+++ b/resume/殷维_国联民生_量化研究员简历.docx
@@ -4,1298 +4,1009 @@
   <w:body>
     <w:p>
       <w:pPr>
-        <w:spacing w:after="20"/>
+        <w:spacing w:before="0" w:after="40" w:line="252" w:lineRule="auto"/>
         <w:jc w:val="center"/>
       </w:pPr>
       <w:r>
         <w:rPr>
-          <w:rFonts w:ascii="黑体" w:hAnsi="黑体" w:eastAsia="黑体"/>
+          <w:rFonts w:ascii="Aptos" w:hAnsi="Aptos" w:eastAsia="Microsoft YaHei"/>
           <w:b/>
-          <w:color w:val="1F4E79"/>
-          <w:sz w:val="40"/>
+          <w:i w:val="0"/>
+          <w:color w:val="1A535C"/>
+          <w:sz w:val="36"/>
         </w:rPr>
         <w:t>殷  维</w:t>
       </w:r>
     </w:p>
     <w:p>
       <w:pPr>
-        <w:spacing w:after="20" w:before="0" w:line="259" w:lineRule="auto"/>
+        <w:spacing w:before="0" w:after="120" w:line="252" w:lineRule="auto"/>
         <w:jc w:val="center"/>
       </w:pPr>
       <w:r>
         <w:rPr>
-          <w:rFonts w:ascii="宋体" w:hAnsi="宋体" w:eastAsia="宋体"/>
+          <w:rFonts w:ascii="Aptos" w:hAnsi="Aptos" w:eastAsia="Microsoft YaHei"/>
           <w:b w:val="0"/>
-          <w:color w:val="555555"/>
-          <w:sz w:val="22"/>
+          <w:i w:val="0"/>
+          <w:color w:val="5A5A5A"/>
+          <w:sz w:val="20"/>
         </w:rPr>
-        <w:t>量化研究员  |  金融硕士（华中科技大学）  |  6年A股量化研究与实盘</w:t>
+        <w:t>女 | 31岁 | 中共党员 | 武汉（可到岗北京/上海） | 15671678098 | yw43@foxmail.com</w:t>
       </w:r>
     </w:p>
     <w:p>
       <w:pPr>
-        <w:spacing w:after="40" w:before="0" w:line="259" w:lineRule="auto"/>
-        <w:jc w:val="center"/>
+        <w:spacing w:before="40" w:after="120" w:line="252" w:lineRule="auto"/>
       </w:pPr>
       <w:r>
         <w:rPr>
-          <w:rFonts w:ascii="宋体" w:hAnsi="宋体" w:eastAsia="宋体"/>
-          <w:b w:val="0"/>
-          <w:color w:val="555555"/>
+          <w:rFonts w:ascii="Aptos" w:hAnsi="Aptos" w:eastAsia="Microsoft YaHei"/>
+          <w:b/>
+          <w:i w:val="0"/>
+          <w:color w:val="1A535C"/>
           <w:sz w:val="20"/>
         </w:rPr>
-        <w:t>女  |  31岁  |  中共党员  |  武汉（可到岗北京/上海）  |  15671678098  |  yw43@foxmail.com</w:t>
+        <w:t>求职意向：</w:t>
+      </w:r>
+      <w:r>
+        <w:rPr>
+          <w:rFonts w:ascii="Aptos" w:hAnsi="Aptos" w:eastAsia="Microsoft YaHei"/>
+          <w:b w:val="0"/>
+          <w:i w:val="0"/>
+          <w:color w:val="222222"/>
+          <w:sz w:val="20"/>
+        </w:rPr>
+        <w:t>量化研究员（股票多因子 / 指数增强 / 市场中性）｜社招全职｜华中科技大学金融硕士，具备因子研究全流程、回测纪律与失效边界、流动性与交易成本约束意识、股指CTA/期现对话能力，以及 Python（pandas/numpy）研究工程化。曾用分钟级板块因子叠加日线量价完成可复现选股回测。希望加入国联民生证券量化研究团队。</w:t>
       </w:r>
     </w:p>
     <w:p>
       <w:pPr>
-        <w:spacing w:before="160" w:after="60" w:line="245" w:lineRule="auto"/>
+        <w:spacing w:before="160" w:after="60" w:line="252" w:lineRule="auto"/>
         <w:pBdr>
-          <w:bottom w:val="single" w:sz="12" w:space="1" w:color="1F4E79"/>
+          <w:bottom w:val="single" w:sz="6" w:space="2" w:color="1A535C"/>
         </w:pBdr>
       </w:pPr>
       <w:r>
         <w:rPr>
-          <w:rFonts w:ascii="黑体" w:hAnsi="黑体" w:eastAsia="黑体"/>
+          <w:rFonts w:ascii="Aptos" w:hAnsi="Aptos" w:eastAsia="Microsoft YaHei"/>
           <w:b/>
-          <w:color w:val="1F4E79"/>
-          <w:sz w:val="25"/>
-        </w:rPr>
-        <w:t>求职意向</w:t>
-      </w:r>
-    </w:p>
-    <w:p>
-      <w:pPr>
-        <w:spacing w:after="40" w:before="0" w:line="259" w:lineRule="auto"/>
-      </w:pPr>
-      <w:r>
-        <w:rPr>
-          <w:rFonts w:ascii="宋体" w:hAnsi="宋体" w:eastAsia="宋体"/>
-          <w:b w:val="0"/>
-          <w:color w:val="2D2D2D"/>
-          <w:sz w:val="21"/>
-        </w:rPr>
-        <w:t>国联民生证券  |  股权衍生品业务部  |  自营量化研究员（股票量化 / 因子研究 / 策略回测）</w:t>
-      </w:r>
-    </w:p>
-    <w:p>
-      <w:pPr>
-        <w:spacing w:before="160" w:after="60" w:line="245" w:lineRule="auto"/>
-        <w:pBdr>
-          <w:bottom w:val="single" w:sz="12" w:space="1" w:color="1F4E79"/>
-        </w:pBdr>
-      </w:pPr>
-      <w:r>
-        <w:rPr>
-          <w:rFonts w:ascii="黑体" w:hAnsi="黑体" w:eastAsia="黑体"/>
-          <w:b/>
-          <w:color w:val="1F4E79"/>
-          <w:sz w:val="25"/>
+          <w:i w:val="0"/>
+          <w:color w:val="1A535C"/>
+          <w:sz w:val="24"/>
         </w:rPr>
         <w:t>核心匹配</w:t>
       </w:r>
     </w:p>
     <w:p>
       <w:pPr>
-        <w:pStyle w:val="ListBullet"/>
-        <w:spacing w:after="24" w:before="0" w:line="259" w:lineRule="auto"/>
+        <w:spacing w:before="20" w:after="20" w:line="252" w:lineRule="auto"/>
       </w:pPr>
       <w:r>
         <w:rPr>
-          <w:rFonts w:ascii="宋体" w:hAnsi="宋体" w:eastAsia="宋体"/>
+          <w:rFonts w:ascii="Aptos" w:hAnsi="Aptos" w:eastAsia="Microsoft YaHei"/>
+          <w:b/>
+          <w:i w:val="0"/>
+          <w:color w:val="222222"/>
+          <w:sz w:val="20"/>
+        </w:rPr>
+        <w:t>因子全流程：</w:t>
+      </w:r>
+      <w:r>
+        <w:rPr>
+          <w:rFonts w:ascii="Aptos" w:hAnsi="Aptos" w:eastAsia="Microsoft YaHei"/>
           <w:b w:val="0"/>
-          <w:sz w:val="21"/>
+          <w:i w:val="0"/>
+          <w:color w:val="222222"/>
+          <w:sz w:val="20"/>
         </w:rPr>
-        <w:t>6年量化研究经历，覆盖多头选股、财务与基本面选股、行业与赛道轮动、套利与做市、股指期货CTA；可独立完成数据清洗、因子挖掘、回测验证、组合构建与实盘跟踪全流程。</w:t>
+        <w:t>独立完成数据清洗、因子挖掘、评价、合成与回测；分钟级板块因子叠加日线量价做择时选股，掘金策略样本内年化17.14%、最大回撤2%、夏普3.4。</w:t>
       </w:r>
     </w:p>
     <w:p>
       <w:pPr>
-        <w:pStyle w:val="ListBullet"/>
-        <w:spacing w:after="24" w:before="0" w:line="259" w:lineRule="auto"/>
+        <w:spacing w:before="20" w:after="20" w:line="252" w:lineRule="auto"/>
       </w:pPr>
       <w:r>
         <w:rPr>
-          <w:rFonts w:ascii="宋体" w:hAnsi="宋体" w:eastAsia="宋体"/>
+          <w:rFonts w:ascii="Aptos" w:hAnsi="Aptos" w:eastAsia="Microsoft YaHei"/>
+          <w:b/>
+          <w:i w:val="0"/>
+          <w:color w:val="222222"/>
+          <w:sz w:val="20"/>
+        </w:rPr>
+        <w:t>回测纪律：</w:t>
+      </w:r>
+      <w:r>
+        <w:rPr>
+          <w:rFonts w:ascii="Aptos" w:hAnsi="Aptos" w:eastAsia="Microsoft YaHei"/>
           <w:b w:val="0"/>
-          <w:sz w:val="21"/>
+          <w:i w:val="0"/>
+          <w:color w:val="222222"/>
+          <w:sz w:val="20"/>
         </w:rPr>
-        <w:t>股票量化：搭建标准化财务选股模型与季度核心股票池；以分钟级板块因子叠加日线量价因子做择时选股，掘金策略样本内年化17.14%、最大回撤2%、夏普3.4。</w:t>
+        <w:t>对短线动量策略做过滤与对照回测，最大单笔亏损由约-27%降至约-17%；主动写出适用边界：趋势延续期有效，低波动与下跌区间信号质量下降。</w:t>
       </w:r>
     </w:p>
     <w:p>
       <w:pPr>
-        <w:pStyle w:val="ListBullet"/>
-        <w:spacing w:after="24" w:before="0" w:line="259" w:lineRule="auto"/>
+        <w:spacing w:before="20" w:after="20" w:line="252" w:lineRule="auto"/>
       </w:pPr>
       <w:r>
         <w:rPr>
-          <w:rFonts w:ascii="宋体" w:hAnsi="宋体" w:eastAsia="宋体"/>
+          <w:rFonts w:ascii="Aptos" w:hAnsi="Aptos" w:eastAsia="Microsoft YaHei"/>
+          <w:b/>
+          <w:i w:val="0"/>
+          <w:color w:val="222222"/>
+          <w:sz w:val="20"/>
+        </w:rPr>
+        <w:t>可交易性：</w:t>
+      </w:r>
+      <w:r>
+        <w:rPr>
+          <w:rFonts w:ascii="Aptos" w:hAnsi="Aptos" w:eastAsia="Microsoft YaHei"/>
           <w:b w:val="0"/>
-          <w:sz w:val="21"/>
+          <w:i w:val="0"/>
+          <w:color w:val="222222"/>
+          <w:sz w:val="20"/>
         </w:rPr>
-        <w:t>实盘跟踪与归因：2025年资金加权收益率年化约60%，2026年截至8月约40%；具备回撤拆解、参数与因子组合稳健性检验、策略迭代经验。</w:t>
+        <w:t>关注停复牌、涨跌停、交易成本、滑点与流动性造成的回测-实盘差异；江铜阶段做过量化私募尽调与流动性跟踪。</w:t>
       </w:r>
     </w:p>
     <w:p>
       <w:pPr>
-        <w:pStyle w:val="ListBullet"/>
-        <w:spacing w:after="24" w:before="0" w:line="259" w:lineRule="auto"/>
+        <w:spacing w:before="20" w:after="20" w:line="252" w:lineRule="auto"/>
       </w:pPr>
       <w:r>
         <w:rPr>
-          <w:rFonts w:ascii="宋体" w:hAnsi="宋体" w:eastAsia="宋体"/>
+          <w:rFonts w:ascii="Aptos" w:hAnsi="Aptos" w:eastAsia="Microsoft YaHei"/>
+          <w:b/>
+          <w:i w:val="0"/>
+          <w:color w:val="222222"/>
+          <w:sz w:val="20"/>
+        </w:rPr>
+        <w:t>CTA与工程：</w:t>
+      </w:r>
+      <w:r>
+        <w:rPr>
+          <w:rFonts w:ascii="Aptos" w:hAnsi="Aptos" w:eastAsia="Microsoft YaHei"/>
           <w:b w:val="0"/>
-          <w:sz w:val="21"/>
+          <w:i w:val="0"/>
+          <w:color w:val="222222"/>
+          <w:sz w:val="20"/>
         </w:rPr>
-        <w:t>数据与工程：Python（Pandas / Numpy / Talib）处理日频与分钟行情、财报与业绩预告等截面数据；可在Linux服务器完成回测与信号脚本部署、定时任务与日志监控。</w:t>
+        <w:t>2022年用 Python + tbquant 完成股指期货模式识别策略的开发与回测；可在 Linux 上部署回测/信号脚本、定时任务与日志。</w:t>
       </w:r>
     </w:p>
     <w:p>
       <w:pPr>
-        <w:pStyle w:val="ListBullet"/>
-        <w:spacing w:after="24" w:before="0" w:line="259" w:lineRule="auto"/>
+        <w:spacing w:before="160" w:after="60" w:line="252" w:lineRule="auto"/>
+        <w:pBdr>
+          <w:bottom w:val="single" w:sz="6" w:space="2" w:color="1A535C"/>
+        </w:pBdr>
       </w:pPr>
       <w:r>
         <w:rPr>
-          <w:rFonts w:ascii="宋体" w:hAnsi="宋体" w:eastAsia="宋体"/>
-          <w:b w:val="0"/>
-          <w:sz w:val="21"/>
+          <w:rFonts w:ascii="Aptos" w:hAnsi="Aptos" w:eastAsia="Microsoft YaHei"/>
+          <w:b/>
+          <w:i w:val="0"/>
+          <w:color w:val="1A535C"/>
+          <w:sz w:val="24"/>
         </w:rPr>
-        <w:t>实盘约束意识：关注A股停复牌、涨跌停、交易成本、滑点与可成交性对回测与实盘差异的影响，回测中重视样本外表现与过拟合识别。</w:t>
+        <w:t>工作经历</w:t>
       </w:r>
     </w:p>
     <w:p>
       <w:pPr>
-        <w:spacing w:before="160" w:after="60" w:line="245" w:lineRule="auto"/>
+        <w:tabs>
+          <w:tab w:pos="9638" w:val="right"/>
+        </w:tabs>
+        <w:spacing w:before="80" w:after="20" w:line="252" w:lineRule="auto"/>
+      </w:pPr>
+      <w:r>
+        <w:rPr>
+          <w:rFonts w:ascii="Aptos" w:hAnsi="Aptos" w:eastAsia="Microsoft YaHei"/>
+          <w:b/>
+          <w:i w:val="0"/>
+          <w:color w:val="222222"/>
+          <w:sz w:val="20"/>
+        </w:rPr>
+        <w:t>【请填公司全称】（私募基金）  |  量化研究</w:t>
+      </w:r>
+      <w:r>
+        <w:rPr>
+          <w:rFonts w:ascii="Aptos" w:hAnsi="Aptos" w:eastAsia="Microsoft YaHei"/>
+          <w:b w:val="0"/>
+          <w:i w:val="0"/>
+          <w:color w:val="5A5A5A"/>
+          <w:sz w:val="20"/>
+        </w:rPr>
+        <w:tab/>
+        <w:t>2026.06 – 至今</w:t>
+      </w:r>
+    </w:p>
+    <w:p>
+      <w:pPr>
+        <w:spacing w:before="0" w:after="20" w:line="252" w:lineRule="auto"/>
+        <w:ind w:left="283"/>
+      </w:pPr>
+      <w:r>
+        <w:rPr>
+          <w:rFonts w:ascii="Aptos" w:hAnsi="Aptos" w:eastAsia="Microsoft YaHei"/>
+          <w:b w:val="0"/>
+          <w:i w:val="0"/>
+          <w:color w:val="222222"/>
+          <w:sz w:val="20"/>
+        </w:rPr>
+        <w:t>• 日常以投研流程工程化为主（日报与脚本落地、Linux 定时任务）；后期承接短线策略的验证与优化，而非从一开始就负责完整产品线。</w:t>
+      </w:r>
+    </w:p>
+    <w:p>
+      <w:pPr>
+        <w:spacing w:before="0" w:after="20" w:line="252" w:lineRule="auto"/>
+        <w:ind w:left="283"/>
+      </w:pPr>
+      <w:r>
+        <w:rPr>
+          <w:rFonts w:ascii="Aptos" w:hAnsi="Aptos" w:eastAsia="Microsoft YaHei"/>
+          <w:b w:val="0"/>
+          <w:i w:val="0"/>
+          <w:color w:val="222222"/>
+          <w:sz w:val="20"/>
+        </w:rPr>
+        <w:t>• 承接强势股放量策略验证：设计「收盘价/前20日最低价&lt;130%」等过滤，重构收益率测算，用对照回测把最大单笔亏损由约-27%压至约-17%。</w:t>
+      </w:r>
+    </w:p>
+    <w:p>
+      <w:pPr>
+        <w:spacing w:before="0" w:after="20" w:line="252" w:lineRule="auto"/>
+        <w:ind w:left="283"/>
+      </w:pPr>
+      <w:r>
+        <w:rPr>
+          <w:rFonts w:ascii="Aptos" w:hAnsi="Aptos" w:eastAsia="Microsoft YaHei"/>
+          <w:b w:val="0"/>
+          <w:i w:val="0"/>
+          <w:color w:val="222222"/>
+          <w:sz w:val="20"/>
+        </w:rPr>
+        <w:t>• 识别该短线动量策略的失效边界：收益主要来自放量突破后的趋势延续，低波动与下跌区间信号质量下降；改进方向是市场状态过滤与仓位控制，而不是把样本内曲线当成产品结论。</w:t>
+      </w:r>
+    </w:p>
+    <w:p>
+      <w:pPr>
+        <w:spacing w:before="0" w:after="20" w:line="252" w:lineRule="auto"/>
+        <w:ind w:left="283"/>
+      </w:pPr>
+      <w:r>
+        <w:rPr>
+          <w:rFonts w:ascii="Aptos" w:hAnsi="Aptos" w:eastAsia="Microsoft YaHei"/>
+          <w:b w:val="0"/>
+          <w:i w:val="0"/>
+          <w:color w:val="222222"/>
+          <w:sz w:val="20"/>
+        </w:rPr>
+        <w:t>• 负责分钟级行情扫描与信号推送；在 Linux 服务器完成脚本部署、定时任务与日志监控，保证信号生成可复现、可跟踪。</w:t>
+      </w:r>
+    </w:p>
+    <w:p>
+      <w:pPr>
+        <w:tabs>
+          <w:tab w:pos="9638" w:val="right"/>
+        </w:tabs>
+        <w:spacing w:before="80" w:after="20" w:line="252" w:lineRule="auto"/>
+      </w:pPr>
+      <w:r>
+        <w:rPr>
+          <w:rFonts w:ascii="Aptos" w:hAnsi="Aptos" w:eastAsia="Microsoft YaHei"/>
+          <w:b/>
+          <w:i w:val="0"/>
+          <w:color w:val="222222"/>
+          <w:sz w:val="20"/>
+        </w:rPr>
+        <w:t>量化研究工作室  |  独立研究员</w:t>
+      </w:r>
+      <w:r>
+        <w:rPr>
+          <w:rFonts w:ascii="Aptos" w:hAnsi="Aptos" w:eastAsia="Microsoft YaHei"/>
+          <w:b w:val="0"/>
+          <w:i w:val="0"/>
+          <w:color w:val="5A5A5A"/>
+          <w:sz w:val="20"/>
+        </w:rPr>
+        <w:tab/>
+        <w:t>2024.03 – 2026.05</w:t>
+      </w:r>
+    </w:p>
+    <w:p>
+      <w:pPr>
+        <w:spacing w:before="0" w:after="20" w:line="252" w:lineRule="auto"/>
+        <w:ind w:left="283"/>
+      </w:pPr>
+      <w:r>
+        <w:rPr>
+          <w:rFonts w:ascii="Aptos" w:hAnsi="Aptos" w:eastAsia="Microsoft YaHei"/>
+          <w:b w:val="0"/>
+          <w:i w:val="0"/>
+          <w:color w:val="222222"/>
+          <w:sz w:val="20"/>
+        </w:rPr>
+        <w:t>• 行业与赛道轮动：结合宏观与行业框架跟踪热点赛道，为多头策略定调；完善短线买卖点与持仓纪律，持续做实盘跟踪与收益归因。</w:t>
+      </w:r>
+    </w:p>
+    <w:p>
+      <w:pPr>
+        <w:spacing w:before="0" w:after="20" w:line="252" w:lineRule="auto"/>
+        <w:ind w:left="283"/>
+      </w:pPr>
+      <w:r>
+        <w:rPr>
+          <w:rFonts w:ascii="Aptos" w:hAnsi="Aptos" w:eastAsia="Microsoft YaHei"/>
+          <w:b w:val="0"/>
+          <w:i w:val="0"/>
+          <w:color w:val="222222"/>
+          <w:sz w:val="20"/>
+        </w:rPr>
+        <w:t>• 基本面因子与选股：搭建标准化财务选股模型，按季度更新核心股票池；建设全市场财报采集与业绩预告/快报流程，将基本面与事件数据接入选股。</w:t>
+      </w:r>
+    </w:p>
+    <w:p>
+      <w:pPr>
+        <w:spacing w:before="0" w:after="20" w:line="252" w:lineRule="auto"/>
+        <w:ind w:left="283"/>
+      </w:pPr>
+      <w:r>
+        <w:rPr>
+          <w:rFonts w:ascii="Aptos" w:hAnsi="Aptos" w:eastAsia="Microsoft YaHei"/>
+          <w:b w:val="0"/>
+          <w:i w:val="0"/>
+          <w:color w:val="222222"/>
+          <w:sz w:val="20"/>
+        </w:rPr>
+        <w:t>• 实盘结果（个人研究账户、资金加权，非管理规模）：2025年年化约60%，2026年截至8月约40%。</w:t>
+      </w:r>
+    </w:p>
+    <w:p>
+      <w:pPr>
+        <w:tabs>
+          <w:tab w:pos="9638" w:val="right"/>
+        </w:tabs>
+        <w:spacing w:before="80" w:after="20" w:line="252" w:lineRule="auto"/>
+      </w:pPr>
+      <w:r>
+        <w:rPr>
+          <w:rFonts w:ascii="Aptos" w:hAnsi="Aptos" w:eastAsia="Microsoft YaHei"/>
+          <w:b/>
+          <w:i w:val="0"/>
+          <w:color w:val="222222"/>
+          <w:sz w:val="20"/>
+        </w:rPr>
+        <w:t>深圳引力波量化科技有限公司  |  量化研究员</w:t>
+      </w:r>
+      <w:r>
+        <w:rPr>
+          <w:rFonts w:ascii="Aptos" w:hAnsi="Aptos" w:eastAsia="Microsoft YaHei"/>
+          <w:b w:val="0"/>
+          <w:i w:val="0"/>
+          <w:color w:val="5A5A5A"/>
+          <w:sz w:val="20"/>
+        </w:rPr>
+        <w:tab/>
+        <w:t>2023.10 – 2024.02</w:t>
+      </w:r>
+    </w:p>
+    <w:p>
+      <w:pPr>
+        <w:spacing w:before="0" w:after="20" w:line="252" w:lineRule="auto"/>
+        <w:ind w:left="283"/>
+      </w:pPr>
+      <w:r>
+        <w:rPr>
+          <w:rFonts w:ascii="Aptos" w:hAnsi="Aptos" w:eastAsia="Microsoft YaHei"/>
+          <w:b w:val="0"/>
+          <w:i w:val="0"/>
+          <w:color w:val="222222"/>
+          <w:sz w:val="20"/>
+        </w:rPr>
+        <w:t>• 负责行情与交易数据获取，使用 Pandas、Numpy、Talib 完成清洗、特征处理与分析。</w:t>
+      </w:r>
+    </w:p>
+    <w:p>
+      <w:pPr>
+        <w:spacing w:before="0" w:after="20" w:line="252" w:lineRule="auto"/>
+        <w:ind w:left="283"/>
+      </w:pPr>
+      <w:r>
+        <w:rPr>
+          <w:rFonts w:ascii="Aptos" w:hAnsi="Aptos" w:eastAsia="Microsoft YaHei"/>
+          <w:b w:val="0"/>
+          <w:i w:val="0"/>
+          <w:color w:val="222222"/>
+          <w:sz w:val="20"/>
+        </w:rPr>
+        <w:t>• 参与套利、做市等策略的开发与日常优化，关注价差、持仓风险、成交质量与策略稳定性。</w:t>
+      </w:r>
+    </w:p>
+    <w:p>
+      <w:pPr>
+        <w:tabs>
+          <w:tab w:pos="9638" w:val="right"/>
+        </w:tabs>
+        <w:spacing w:before="80" w:after="20" w:line="252" w:lineRule="auto"/>
+      </w:pPr>
+      <w:r>
+        <w:rPr>
+          <w:rFonts w:ascii="Aptos" w:hAnsi="Aptos" w:eastAsia="Microsoft YaHei"/>
+          <w:b/>
+          <w:i w:val="0"/>
+          <w:color w:val="222222"/>
+          <w:sz w:val="20"/>
+        </w:rPr>
+        <w:t>江铜产融控股有限公司  |  量化研究员</w:t>
+      </w:r>
+      <w:r>
+        <w:rPr>
+          <w:rFonts w:ascii="Aptos" w:hAnsi="Aptos" w:eastAsia="Microsoft YaHei"/>
+          <w:b w:val="0"/>
+          <w:i w:val="0"/>
+          <w:color w:val="5A5A5A"/>
+          <w:sz w:val="20"/>
+        </w:rPr>
+        <w:tab/>
+        <w:t>2022.01 – 2023.09</w:t>
+      </w:r>
+    </w:p>
+    <w:p>
+      <w:pPr>
+        <w:spacing w:before="0" w:after="20" w:line="252" w:lineRule="auto"/>
+        <w:ind w:left="283"/>
+      </w:pPr>
+      <w:r>
+        <w:rPr>
+          <w:rFonts w:ascii="Aptos" w:hAnsi="Aptos" w:eastAsia="Microsoft YaHei"/>
+          <w:b w:val="0"/>
+          <w:i w:val="0"/>
+          <w:color w:val="222222"/>
+          <w:sz w:val="20"/>
+        </w:rPr>
+        <w:t>• 对北上深量化私募做问卷设计与实地尽调并撰写报告，覆盖策略逻辑、因子来源、风险控制与实盘约束。</w:t>
+      </w:r>
+    </w:p>
+    <w:p>
+      <w:pPr>
+        <w:spacing w:before="0" w:after="20" w:line="252" w:lineRule="auto"/>
+        <w:ind w:left="283"/>
+      </w:pPr>
+      <w:r>
+        <w:rPr>
+          <w:rFonts w:ascii="Aptos" w:hAnsi="Aptos" w:eastAsia="Microsoft YaHei"/>
+          <w:b w:val="0"/>
+          <w:i w:val="0"/>
+          <w:color w:val="222222"/>
+          <w:sz w:val="20"/>
+        </w:rPr>
+        <w:t>• 搭建二级市场研究框架，跟踪流动性等风险指标，服务投研判断与资产配置。</w:t>
+      </w:r>
+    </w:p>
+    <w:p>
+      <w:pPr>
+        <w:tabs>
+          <w:tab w:pos="9638" w:val="right"/>
+        </w:tabs>
+        <w:spacing w:before="80" w:after="20" w:line="252" w:lineRule="auto"/>
+      </w:pPr>
+      <w:r>
+        <w:rPr>
+          <w:rFonts w:ascii="Aptos" w:hAnsi="Aptos" w:eastAsia="Microsoft YaHei"/>
+          <w:b/>
+          <w:i w:val="0"/>
+          <w:color w:val="222222"/>
+          <w:sz w:val="20"/>
+        </w:rPr>
+        <w:t>量盈私募基金管理有限公司  |  量化研究员</w:t>
+      </w:r>
+      <w:r>
+        <w:rPr>
+          <w:rFonts w:ascii="Aptos" w:hAnsi="Aptos" w:eastAsia="Microsoft YaHei"/>
+          <w:b w:val="0"/>
+          <w:i w:val="0"/>
+          <w:color w:val="5A5A5A"/>
+          <w:sz w:val="20"/>
+        </w:rPr>
+        <w:tab/>
+        <w:t>2020.08 – 2021.12</w:t>
+      </w:r>
+    </w:p>
+    <w:p>
+      <w:pPr>
+        <w:spacing w:before="0" w:after="20" w:line="252" w:lineRule="auto"/>
+        <w:ind w:left="283"/>
+      </w:pPr>
+      <w:r>
+        <w:rPr>
+          <w:rFonts w:ascii="Aptos" w:hAnsi="Aptos" w:eastAsia="Microsoft YaHei"/>
+          <w:b w:val="0"/>
+          <w:i w:val="0"/>
+          <w:color w:val="222222"/>
+          <w:sz w:val="20"/>
+        </w:rPr>
+        <w:t>• 基于聚宽、掘金做股票与期货因子挖掘、策略开发及回测优化，覆盖日频量价与基本面相关因子。</w:t>
+      </w:r>
+    </w:p>
+    <w:p>
+      <w:pPr>
+        <w:spacing w:before="0" w:after="20" w:line="252" w:lineRule="auto"/>
+        <w:ind w:left="283"/>
+      </w:pPr>
+      <w:r>
+        <w:rPr>
+          <w:rFonts w:ascii="Aptos" w:hAnsi="Aptos" w:eastAsia="Microsoft YaHei"/>
+          <w:b w:val="0"/>
+          <w:i w:val="0"/>
+          <w:color w:val="222222"/>
+          <w:sz w:val="20"/>
+        </w:rPr>
+        <w:t>• 按基金经理要求用 Python 复现券商金工研报，校验因子定义、去极值与标准化、回测口径及样本外表现。</w:t>
+      </w:r>
+    </w:p>
+    <w:p>
+      <w:pPr>
+        <w:tabs>
+          <w:tab w:pos="9638" w:val="right"/>
+        </w:tabs>
+        <w:spacing w:before="80" w:after="20" w:line="252" w:lineRule="auto"/>
+      </w:pPr>
+      <w:r>
+        <w:rPr>
+          <w:rFonts w:ascii="Aptos" w:hAnsi="Aptos" w:eastAsia="Microsoft YaHei"/>
+          <w:b/>
+          <w:i w:val="0"/>
+          <w:color w:val="222222"/>
+          <w:sz w:val="20"/>
+        </w:rPr>
+        <w:t>中国平安财产保险股份有限公司  |  再保险业务管理岗（管培生）</w:t>
+      </w:r>
+      <w:r>
+        <w:rPr>
+          <w:rFonts w:ascii="Aptos" w:hAnsi="Aptos" w:eastAsia="Microsoft YaHei"/>
+          <w:b w:val="0"/>
+          <w:i w:val="0"/>
+          <w:color w:val="5A5A5A"/>
+          <w:sz w:val="20"/>
+        </w:rPr>
+        <w:tab/>
+        <w:t>2019.07 – 2020.07</w:t>
+      </w:r>
+    </w:p>
+    <w:p>
+      <w:pPr>
+        <w:spacing w:before="0" w:after="20" w:line="252" w:lineRule="auto"/>
+        <w:ind w:left="283"/>
+      </w:pPr>
+      <w:r>
+        <w:rPr>
+          <w:rFonts w:ascii="Aptos" w:hAnsi="Aptos" w:eastAsia="Microsoft YaHei"/>
+          <w:b w:val="0"/>
+          <w:i w:val="0"/>
+          <w:color w:val="222222"/>
+          <w:sz w:val="20"/>
+        </w:rPr>
+        <w:t>• 负责再保人月度资信更新、季度坏账计提与风险指标监控，并汇总关联与非关联交易数据。</w:t>
+      </w:r>
+    </w:p>
+    <w:p>
+      <w:pPr>
+        <w:spacing w:before="160" w:after="60" w:line="252" w:lineRule="auto"/>
         <w:pBdr>
-          <w:bottom w:val="single" w:sz="12" w:space="1" w:color="1F4E79"/>
+          <w:bottom w:val="single" w:sz="6" w:space="2" w:color="1A535C"/>
         </w:pBdr>
       </w:pPr>
       <w:r>
         <w:rPr>
-          <w:rFonts w:ascii="黑体" w:hAnsi="黑体" w:eastAsia="黑体"/>
+          <w:rFonts w:ascii="Aptos" w:hAnsi="Aptos" w:eastAsia="Microsoft YaHei"/>
           <w:b/>
-          <w:color w:val="1F4E79"/>
-          <w:sz w:val="25"/>
+          <w:i w:val="0"/>
+          <w:color w:val="1A535C"/>
+          <w:sz w:val="24"/>
         </w:rPr>
-        <w:t>工作经历</w:t>
-      </w:r>
-    </w:p>
-    <w:tbl>
-      <w:tblPr>
-        <w:tblW w:type="auto" w:w="0"/>
-        <w:tblLayout w:type="autofit"/>
-        <w:tblLook w:firstColumn="1" w:firstRow="1" w:lastColumn="0" w:lastRow="0" w:noHBand="0" w:noVBand="1" w:val="04A0"/>
-        <w:tblBorders>
-          <w:top w:val="nil"/>
-          <w:left w:val="nil"/>
-          <w:bottom w:val="nil"/>
-          <w:right w:val="nil"/>
-          <w:insideH w:val="nil"/>
-          <w:insideV w:val="nil"/>
-        </w:tblBorders>
-      </w:tblPr>
-      <w:tblGrid>
-        <w:gridCol w:w="5046"/>
-        <w:gridCol w:w="5046"/>
-      </w:tblGrid>
-      <w:tr>
-        <w:tc>
-          <w:tcPr>
-            <w:tcW w:type="dxa" w:w="5046"/>
-          </w:tcPr>
-          <w:p>
-            <w:pPr>
-              <w:spacing w:before="60" w:after="20"/>
-            </w:pPr>
-            <w:r/>
-            <w:r>
-              <w:rPr>
-                <w:rFonts w:ascii="黑体" w:hAnsi="黑体" w:eastAsia="黑体"/>
-                <w:b/>
-                <w:color w:val="2D2D2D"/>
-                <w:sz w:val="21"/>
-              </w:rPr>
-              <w:t>【请填公司全称】（私募基金）  |  量化研究</w:t>
-            </w:r>
-          </w:p>
-        </w:tc>
-        <w:tc>
-          <w:tcPr>
-            <w:tcW w:type="dxa" w:w="5046"/>
-          </w:tcPr>
-          <w:p>
-            <w:pPr>
-              <w:spacing w:before="60" w:after="20"/>
-              <w:jc w:val="right"/>
-            </w:pPr>
-            <w:r/>
-            <w:r>
-              <w:rPr>
-                <w:rFonts w:ascii="宋体" w:hAnsi="宋体" w:eastAsia="宋体"/>
-                <w:b w:val="0"/>
-                <w:color w:val="555555"/>
-                <w:sz w:val="20"/>
-              </w:rPr>
-              <w:t>2026.06 – 至今</w:t>
-            </w:r>
-          </w:p>
-        </w:tc>
-      </w:tr>
-    </w:tbl>
-    <w:p>
-      <w:pPr>
-        <w:pStyle w:val="ListBullet"/>
-        <w:spacing w:after="24" w:before="0" w:line="259" w:lineRule="auto"/>
-      </w:pPr>
-      <w:r>
-        <w:rPr>
-          <w:rFonts w:ascii="宋体" w:hAnsi="宋体" w:eastAsia="宋体"/>
-          <w:b w:val="0"/>
-          <w:sz w:val="21"/>
-        </w:rPr>
-        <w:t>承接强势股放量策略的验证与优化：设计「收盘价/前20日最低价&lt;130%」等过滤条件，重构收益率测算逻辑，用控制变量法搭建4组14项指标的回测对照表，最大单笔亏损由-27%压缩至-17%。</w:t>
+        <w:t>项目经历</w:t>
       </w:r>
     </w:p>
     <w:p>
       <w:pPr>
-        <w:pStyle w:val="ListBullet"/>
-        <w:spacing w:after="24" w:before="0" w:line="259" w:lineRule="auto"/>
+        <w:tabs>
+          <w:tab w:pos="9638" w:val="right"/>
+        </w:tabs>
+        <w:spacing w:before="80" w:after="20" w:line="252" w:lineRule="auto"/>
       </w:pPr>
       <w:r>
         <w:rPr>
-          <w:rFonts w:ascii="宋体" w:hAnsi="宋体" w:eastAsia="宋体"/>
+          <w:rFonts w:ascii="Aptos" w:hAnsi="Aptos" w:eastAsia="Microsoft YaHei"/>
+          <w:b/>
+          <w:i w:val="0"/>
+          <w:color w:val="222222"/>
+          <w:sz w:val="20"/>
+        </w:rPr>
+        <w:t>股票短线多头策略（掘金）  |  分钟板块因子 + 日线量价</w:t>
+      </w:r>
+      <w:r>
+        <w:rPr>
+          <w:rFonts w:ascii="Aptos" w:hAnsi="Aptos" w:eastAsia="Microsoft YaHei"/>
           <w:b w:val="0"/>
-          <w:sz w:val="21"/>
+          <w:i w:val="0"/>
+          <w:color w:val="5A5A5A"/>
+          <w:sz w:val="20"/>
         </w:rPr>
-        <w:t>识别该类短线动量策略的适用边界：收益主要来自放量突破后的趋势延续，在低波动与下跌区间信号质量明显下降，据此提出加入市场状态过滤与仓位控制的改进方向。</w:t>
+        <w:tab/>
+        <w:t>2022.07 – 至今</w:t>
       </w:r>
     </w:p>
     <w:p>
       <w:pPr>
-        <w:pStyle w:val="ListBullet"/>
-        <w:spacing w:after="24" w:before="0" w:line="259" w:lineRule="auto"/>
+        <w:spacing w:before="0" w:after="20" w:line="252" w:lineRule="auto"/>
+        <w:ind w:left="283"/>
       </w:pPr>
       <w:r>
         <w:rPr>
-          <w:rFonts w:ascii="宋体" w:hAnsi="宋体" w:eastAsia="宋体"/>
+          <w:rFonts w:ascii="Aptos" w:hAnsi="Aptos" w:eastAsia="Microsoft YaHei"/>
           <w:b w:val="0"/>
-          <w:sz w:val="21"/>
+          <w:i w:val="0"/>
+          <w:color w:val="222222"/>
+          <w:sz w:val="20"/>
         </w:rPr>
-        <w:t>负责分钟级行情扫描与信号推送落地，并在Linux服务器完成投研脚本部署、定时任务与日志监控，保证信号生成可复现、可跟踪。</w:t>
-      </w:r>
-    </w:p>
-    <w:tbl>
-      <w:tblPr>
-        <w:tblW w:type="auto" w:w="0"/>
-        <w:tblLayout w:type="autofit"/>
-        <w:tblLook w:firstColumn="1" w:firstRow="1" w:lastColumn="0" w:lastRow="0" w:noHBand="0" w:noVBand="1" w:val="04A0"/>
-        <w:tblBorders>
-          <w:top w:val="nil"/>
-          <w:left w:val="nil"/>
-          <w:bottom w:val="nil"/>
-          <w:right w:val="nil"/>
-          <w:insideH w:val="nil"/>
-          <w:insideV w:val="nil"/>
-        </w:tblBorders>
-      </w:tblPr>
-      <w:tblGrid>
-        <w:gridCol w:w="5046"/>
-        <w:gridCol w:w="5046"/>
-      </w:tblGrid>
-      <w:tr>
-        <w:tc>
-          <w:tcPr>
-            <w:tcW w:type="dxa" w:w="5046"/>
-          </w:tcPr>
-          <w:p>
-            <w:pPr>
-              <w:spacing w:before="60" w:after="20"/>
-            </w:pPr>
-            <w:r/>
-            <w:r>
-              <w:rPr>
-                <w:rFonts w:ascii="黑体" w:hAnsi="黑体" w:eastAsia="黑体"/>
-                <w:b/>
-                <w:color w:val="2D2D2D"/>
-                <w:sz w:val="21"/>
-              </w:rPr>
-              <w:t>量化研究工作室  |  独立研究员</w:t>
-            </w:r>
-          </w:p>
-        </w:tc>
-        <w:tc>
-          <w:tcPr>
-            <w:tcW w:type="dxa" w:w="5046"/>
-          </w:tcPr>
-          <w:p>
-            <w:pPr>
-              <w:spacing w:before="60" w:after="20"/>
-              <w:jc w:val="right"/>
-            </w:pPr>
-            <w:r/>
-            <w:r>
-              <w:rPr>
-                <w:rFonts w:ascii="宋体" w:hAnsi="宋体" w:eastAsia="宋体"/>
-                <w:b w:val="0"/>
-                <w:color w:val="555555"/>
-                <w:sz w:val="20"/>
-              </w:rPr>
-              <w:t>2024.03 – 2026.05</w:t>
-            </w:r>
-          </w:p>
-        </w:tc>
-      </w:tr>
-    </w:tbl>
-    <w:p>
-      <w:pPr>
-        <w:pStyle w:val="ListBullet"/>
-        <w:spacing w:after="24" w:before="0" w:line="259" w:lineRule="auto"/>
-      </w:pPr>
-      <w:r>
-        <w:rPr>
-          <w:rFonts w:ascii="宋体" w:hAnsi="宋体" w:eastAsia="宋体"/>
-          <w:b w:val="0"/>
-          <w:sz w:val="21"/>
-        </w:rPr>
-        <w:t>行业与赛道轮动：结合宏观与行业框架跟踪热点赛道并为多头策略定调；完善短线买卖点与持仓纪律，持续做实盘跟踪与收益归因。</w:t>
+        <w:t>• 用分钟级板块因子刻画短线强度与拥挤度，结合日线量价因子完成择时与选股，形成可回测、可复现的研究流程。</w:t>
       </w:r>
     </w:p>
     <w:p>
       <w:pPr>
-        <w:pStyle w:val="ListBullet"/>
-        <w:spacing w:after="24" w:before="0" w:line="259" w:lineRule="auto"/>
+        <w:spacing w:before="0" w:after="20" w:line="252" w:lineRule="auto"/>
+        <w:ind w:left="283"/>
       </w:pPr>
       <w:r>
         <w:rPr>
-          <w:rFonts w:ascii="宋体" w:hAnsi="宋体" w:eastAsia="宋体"/>
+          <w:rFonts w:ascii="Aptos" w:hAnsi="Aptos" w:eastAsia="Microsoft YaHei"/>
           <w:b w:val="0"/>
-          <w:sz w:val="21"/>
+          <w:i w:val="0"/>
+          <w:color w:val="222222"/>
+          <w:sz w:val="20"/>
         </w:rPr>
-        <w:t>基本面因子与选股：搭建标准化财务选股模型，按季度更新核心股票池；建设全市场财报采集与业绩预告/快报爬虫，将基本面与事件数据接入选股流程。</w:t>
+        <w:t>• 回测关注收益、回撤、夏普、换手与参数稳健性；样本内年化17.14%、最大回撤2%、夏普3.4。</w:t>
       </w:r>
     </w:p>
     <w:p>
       <w:pPr>
-        <w:pStyle w:val="ListBullet"/>
-        <w:spacing w:after="24" w:before="0" w:line="259" w:lineRule="auto"/>
+        <w:spacing w:before="0" w:after="20" w:line="252" w:lineRule="auto"/>
+        <w:ind w:left="283"/>
       </w:pPr>
       <w:r>
         <w:rPr>
-          <w:rFonts w:ascii="宋体" w:hAnsi="宋体" w:eastAsia="宋体"/>
+          <w:rFonts w:ascii="Aptos" w:hAnsi="Aptos" w:eastAsia="Microsoft YaHei"/>
           <w:b w:val="0"/>
-          <w:sz w:val="21"/>
+          <w:i w:val="0"/>
+          <w:color w:val="222222"/>
+          <w:sz w:val="20"/>
         </w:rPr>
-        <w:t>实盘结果：2025年资金加权年化约60%，2026年截至8月约40%。</w:t>
-      </w:r>
-    </w:p>
-    <w:tbl>
-      <w:tblPr>
-        <w:tblW w:type="auto" w:w="0"/>
-        <w:tblLayout w:type="autofit"/>
-        <w:tblLook w:firstColumn="1" w:firstRow="1" w:lastColumn="0" w:lastRow="0" w:noHBand="0" w:noVBand="1" w:val="04A0"/>
-        <w:tblBorders>
-          <w:top w:val="nil"/>
-          <w:left w:val="nil"/>
-          <w:bottom w:val="nil"/>
-          <w:right w:val="nil"/>
-          <w:insideH w:val="nil"/>
-          <w:insideV w:val="nil"/>
-        </w:tblBorders>
-      </w:tblPr>
-      <w:tblGrid>
-        <w:gridCol w:w="5046"/>
-        <w:gridCol w:w="5046"/>
-      </w:tblGrid>
-      <w:tr>
-        <w:tc>
-          <w:tcPr>
-            <w:tcW w:type="dxa" w:w="5046"/>
-          </w:tcPr>
-          <w:p>
-            <w:pPr>
-              <w:spacing w:before="60" w:after="20"/>
-            </w:pPr>
-            <w:r/>
-            <w:r>
-              <w:rPr>
-                <w:rFonts w:ascii="黑体" w:hAnsi="黑体" w:eastAsia="黑体"/>
-                <w:b/>
-                <w:color w:val="2D2D2D"/>
-                <w:sz w:val="21"/>
-              </w:rPr>
-              <w:t>深圳引力波量化科技有限公司  |  量化研究员</w:t>
-            </w:r>
-          </w:p>
-        </w:tc>
-        <w:tc>
-          <w:tcPr>
-            <w:tcW w:type="dxa" w:w="5046"/>
-          </w:tcPr>
-          <w:p>
-            <w:pPr>
-              <w:spacing w:before="60" w:after="20"/>
-              <w:jc w:val="right"/>
-            </w:pPr>
-            <w:r/>
-            <w:r>
-              <w:rPr>
-                <w:rFonts w:ascii="宋体" w:hAnsi="宋体" w:eastAsia="宋体"/>
-                <w:b w:val="0"/>
-                <w:color w:val="555555"/>
-                <w:sz w:val="20"/>
-              </w:rPr>
-              <w:t>2023.10 – 2024.02</w:t>
-            </w:r>
-          </w:p>
-        </w:tc>
-      </w:tr>
-    </w:tbl>
-    <w:p>
-      <w:pPr>
-        <w:pStyle w:val="ListBullet"/>
-        <w:spacing w:after="24" w:before="0" w:line="259" w:lineRule="auto"/>
-      </w:pPr>
-      <w:r>
-        <w:rPr>
-          <w:rFonts w:ascii="宋体" w:hAnsi="宋体" w:eastAsia="宋体"/>
-          <w:b w:val="0"/>
-          <w:sz w:val="21"/>
-        </w:rPr>
-        <w:t>负责行情与交易数据获取，使用Pandas、Numpy、Talib完成清洗、特征处理与分析。</w:t>
+        <w:t>• 编写实盘策略接入掘金日更数据，跟踪信号衰减、滑点与可成交性，持续迭代因子与进出场规则。</w:t>
       </w:r>
     </w:p>
     <w:p>
       <w:pPr>
-        <w:pStyle w:val="ListBullet"/>
-        <w:spacing w:after="24" w:before="0" w:line="259" w:lineRule="auto"/>
+        <w:tabs>
+          <w:tab w:pos="9638" w:val="right"/>
+        </w:tabs>
+        <w:spacing w:before="80" w:after="20" w:line="252" w:lineRule="auto"/>
       </w:pPr>
       <w:r>
         <w:rPr>
-          <w:rFonts w:ascii="宋体" w:hAnsi="宋体" w:eastAsia="宋体"/>
-          <w:b w:val="0"/>
-          <w:sz w:val="21"/>
+          <w:rFonts w:ascii="Aptos" w:hAnsi="Aptos" w:eastAsia="Microsoft YaHei"/>
+          <w:b/>
+          <w:i w:val="0"/>
+          <w:color w:val="222222"/>
+          <w:sz w:val="20"/>
         </w:rPr>
-        <w:t>参与套利、做市等策略开发与日常优化，关注价差、持仓风险、成交质量与策略稳定性。</w:t>
+        <w:t>基本面选股与赛道轮动研究</w:t>
       </w:r>
-    </w:p>
-    <w:tbl>
-      <w:tblPr>
-        <w:tblW w:type="auto" w:w="0"/>
-        <w:tblLayout w:type="autofit"/>
-        <w:tblLook w:firstColumn="1" w:firstRow="1" w:lastColumn="0" w:lastRow="0" w:noHBand="0" w:noVBand="1" w:val="04A0"/>
-        <w:tblBorders>
-          <w:top w:val="nil"/>
-          <w:left w:val="nil"/>
-          <w:bottom w:val="nil"/>
-          <w:right w:val="nil"/>
-          <w:insideH w:val="nil"/>
-          <w:insideV w:val="nil"/>
-        </w:tblBorders>
-      </w:tblPr>
-      <w:tblGrid>
-        <w:gridCol w:w="5046"/>
-        <w:gridCol w:w="5046"/>
-      </w:tblGrid>
-      <w:tr>
-        <w:tc>
-          <w:tcPr>
-            <w:tcW w:type="dxa" w:w="5046"/>
-          </w:tcPr>
-          <w:p>
-            <w:pPr>
-              <w:spacing w:before="60" w:after="20"/>
-            </w:pPr>
-            <w:r/>
-            <w:r>
-              <w:rPr>
-                <w:rFonts w:ascii="黑体" w:hAnsi="黑体" w:eastAsia="黑体"/>
-                <w:b/>
-                <w:color w:val="2D2D2D"/>
-                <w:sz w:val="21"/>
-              </w:rPr>
-              <w:t>江铜产融控股有限公司  |  量化研究员</w:t>
-            </w:r>
-          </w:p>
-        </w:tc>
-        <w:tc>
-          <w:tcPr>
-            <w:tcW w:type="dxa" w:w="5046"/>
-          </w:tcPr>
-          <w:p>
-            <w:pPr>
-              <w:spacing w:before="60" w:after="20"/>
-              <w:jc w:val="right"/>
-            </w:pPr>
-            <w:r/>
-            <w:r>
-              <w:rPr>
-                <w:rFonts w:ascii="宋体" w:hAnsi="宋体" w:eastAsia="宋体"/>
-                <w:b w:val="0"/>
-                <w:color w:val="555555"/>
-                <w:sz w:val="20"/>
-              </w:rPr>
-              <w:t>2022.01 – 2023.09</w:t>
-            </w:r>
-          </w:p>
-        </w:tc>
-      </w:tr>
-    </w:tbl>
-    <w:p>
-      <w:pPr>
-        <w:pStyle w:val="ListBullet"/>
-        <w:spacing w:after="24" w:before="0" w:line="259" w:lineRule="auto"/>
-      </w:pPr>
       <w:r>
         <w:rPr>
-          <w:rFonts w:ascii="宋体" w:hAnsi="宋体" w:eastAsia="宋体"/>
+          <w:rFonts w:ascii="Aptos" w:hAnsi="Aptos" w:eastAsia="Microsoft YaHei"/>
           <w:b w:val="0"/>
-          <w:sz w:val="21"/>
+          <w:i w:val="0"/>
+          <w:color w:val="5A5A5A"/>
+          <w:sz w:val="20"/>
         </w:rPr>
-        <w:t>对北上深量化私募开展问卷设计与实地尽调并撰写尽调报告，覆盖策略逻辑、因子来源、风险控制与实盘约束。</w:t>
+        <w:tab/>
+        <w:t>2024.03 – 至今</w:t>
       </w:r>
     </w:p>
     <w:p>
       <w:pPr>
-        <w:pStyle w:val="ListBullet"/>
-        <w:spacing w:after="24" w:before="0" w:line="259" w:lineRule="auto"/>
+        <w:spacing w:before="0" w:after="20" w:line="252" w:lineRule="auto"/>
+        <w:ind w:left="283"/>
       </w:pPr>
       <w:r>
         <w:rPr>
-          <w:rFonts w:ascii="宋体" w:hAnsi="宋体" w:eastAsia="宋体"/>
+          <w:rFonts w:ascii="Aptos" w:hAnsi="Aptos" w:eastAsia="Microsoft YaHei"/>
           <w:b w:val="0"/>
-          <w:sz w:val="21"/>
+          <w:i w:val="0"/>
+          <w:color w:val="222222"/>
+          <w:sz w:val="20"/>
         </w:rPr>
-        <w:t>搭建二级市场研究框架，跟踪流动性等风险指标，服务投研判断与资产配置。</w:t>
-      </w:r>
-    </w:p>
-    <w:tbl>
-      <w:tblPr>
-        <w:tblW w:type="auto" w:w="0"/>
-        <w:tblLayout w:type="autofit"/>
-        <w:tblLook w:firstColumn="1" w:firstRow="1" w:lastColumn="0" w:lastRow="0" w:noHBand="0" w:noVBand="1" w:val="04A0"/>
-        <w:tblBorders>
-          <w:top w:val="nil"/>
-          <w:left w:val="nil"/>
-          <w:bottom w:val="nil"/>
-          <w:right w:val="nil"/>
-          <w:insideH w:val="nil"/>
-          <w:insideV w:val="nil"/>
-        </w:tblBorders>
-      </w:tblPr>
-      <w:tblGrid>
-        <w:gridCol w:w="5046"/>
-        <w:gridCol w:w="5046"/>
-      </w:tblGrid>
-      <w:tr>
-        <w:tc>
-          <w:tcPr>
-            <w:tcW w:type="dxa" w:w="5046"/>
-          </w:tcPr>
-          <w:p>
-            <w:pPr>
-              <w:spacing w:before="60" w:after="20"/>
-            </w:pPr>
-            <w:r/>
-            <w:r>
-              <w:rPr>
-                <w:rFonts w:ascii="黑体" w:hAnsi="黑体" w:eastAsia="黑体"/>
-                <w:b/>
-                <w:color w:val="2D2D2D"/>
-                <w:sz w:val="21"/>
-              </w:rPr>
-              <w:t>量盈私募基金管理有限公司  |  量化研究员</w:t>
-            </w:r>
-          </w:p>
-        </w:tc>
-        <w:tc>
-          <w:tcPr>
-            <w:tcW w:type="dxa" w:w="5046"/>
-          </w:tcPr>
-          <w:p>
-            <w:pPr>
-              <w:spacing w:before="60" w:after="20"/>
-              <w:jc w:val="right"/>
-            </w:pPr>
-            <w:r/>
-            <w:r>
-              <w:rPr>
-                <w:rFonts w:ascii="宋体" w:hAnsi="宋体" w:eastAsia="宋体"/>
-                <w:b w:val="0"/>
-                <w:color w:val="555555"/>
-                <w:sz w:val="20"/>
-              </w:rPr>
-              <w:t>2020.08 – 2021.12</w:t>
-            </w:r>
-          </w:p>
-        </w:tc>
-      </w:tr>
-    </w:tbl>
-    <w:p>
-      <w:pPr>
-        <w:pStyle w:val="ListBullet"/>
-        <w:spacing w:after="24" w:before="0" w:line="259" w:lineRule="auto"/>
-      </w:pPr>
-      <w:r>
-        <w:rPr>
-          <w:rFonts w:ascii="宋体" w:hAnsi="宋体" w:eastAsia="宋体"/>
-          <w:b w:val="0"/>
-          <w:sz w:val="21"/>
-        </w:rPr>
-        <w:t>基于聚宽、掘金开展股票与期货因子挖掘、策略开发及回测优化，覆盖日频量价与基本面相关因子。</w:t>
+        <w:t>• 把宏观赛道研究、财务选股模型与业绩预告及时性数据结合，服务多头选股与行业轮动判断。</w:t>
       </w:r>
     </w:p>
     <w:p>
       <w:pPr>
-        <w:pStyle w:val="ListBullet"/>
-        <w:spacing w:after="24" w:before="0" w:line="259" w:lineRule="auto"/>
+        <w:tabs>
+          <w:tab w:pos="9638" w:val="right"/>
+        </w:tabs>
+        <w:spacing w:before="80" w:after="20" w:line="252" w:lineRule="auto"/>
       </w:pPr>
       <w:r>
         <w:rPr>
-          <w:rFonts w:ascii="宋体" w:hAnsi="宋体" w:eastAsia="宋体"/>
-          <w:b w:val="0"/>
-          <w:sz w:val="21"/>
+          <w:rFonts w:ascii="Aptos" w:hAnsi="Aptos" w:eastAsia="Microsoft YaHei"/>
+          <w:b/>
+          <w:i w:val="0"/>
+          <w:color w:val="222222"/>
+          <w:sz w:val="20"/>
         </w:rPr>
-        <w:t>按基金经理要求用Python复现券商金工研报，校验因子定义、去极值与标准化处理、回测口径及样本外表现。</w:t>
+        <w:t>期货CTA：基于模式识别的股指策略</w:t>
       </w:r>
-    </w:p>
-    <w:tbl>
-      <w:tblPr>
-        <w:tblW w:type="auto" w:w="0"/>
-        <w:tblLayout w:type="autofit"/>
-        <w:tblLook w:firstColumn="1" w:firstRow="1" w:lastColumn="0" w:lastRow="0" w:noHBand="0" w:noVBand="1" w:val="04A0"/>
-        <w:tblBorders>
-          <w:top w:val="nil"/>
-          <w:left w:val="nil"/>
-          <w:bottom w:val="nil"/>
-          <w:right w:val="nil"/>
-          <w:insideH w:val="nil"/>
-          <w:insideV w:val="nil"/>
-        </w:tblBorders>
-      </w:tblPr>
-      <w:tblGrid>
-        <w:gridCol w:w="5046"/>
-        <w:gridCol w:w="5046"/>
-      </w:tblGrid>
-      <w:tr>
-        <w:tc>
-          <w:tcPr>
-            <w:tcW w:type="dxa" w:w="5046"/>
-          </w:tcPr>
-          <w:p>
-            <w:pPr>
-              <w:spacing w:before="60" w:after="20"/>
-            </w:pPr>
-            <w:r/>
-            <w:r>
-              <w:rPr>
-                <w:rFonts w:ascii="黑体" w:hAnsi="黑体" w:eastAsia="黑体"/>
-                <w:b/>
-                <w:color w:val="2D2D2D"/>
-                <w:sz w:val="21"/>
-              </w:rPr>
-              <w:t>中国平安财产保险股份有限公司  |  再保险业务管理岗（管培生）</w:t>
-            </w:r>
-          </w:p>
-        </w:tc>
-        <w:tc>
-          <w:tcPr>
-            <w:tcW w:type="dxa" w:w="5046"/>
-          </w:tcPr>
-          <w:p>
-            <w:pPr>
-              <w:spacing w:before="60" w:after="20"/>
-              <w:jc w:val="right"/>
-            </w:pPr>
-            <w:r/>
-            <w:r>
-              <w:rPr>
-                <w:rFonts w:ascii="宋体" w:hAnsi="宋体" w:eastAsia="宋体"/>
-                <w:b w:val="0"/>
-                <w:color w:val="555555"/>
-                <w:sz w:val="20"/>
-              </w:rPr>
-              <w:t>2019.07 – 2020.07</w:t>
-            </w:r>
-          </w:p>
-        </w:tc>
-      </w:tr>
-    </w:tbl>
-    <w:p>
-      <w:pPr>
-        <w:pStyle w:val="ListBullet"/>
-        <w:spacing w:after="24" w:before="0" w:line="259" w:lineRule="auto"/>
-      </w:pPr>
       <w:r>
         <w:rPr>
-          <w:rFonts w:ascii="宋体" w:hAnsi="宋体" w:eastAsia="宋体"/>
+          <w:rFonts w:ascii="Aptos" w:hAnsi="Aptos" w:eastAsia="Microsoft YaHei"/>
           <w:b w:val="0"/>
-          <w:sz w:val="21"/>
+          <w:i w:val="0"/>
+          <w:color w:val="5A5A5A"/>
+          <w:sz w:val="20"/>
         </w:rPr>
-        <w:t>负责再保人月度资信更新、季度坏账计提与风险指标监控，并汇总关联与非关联交易数据。</w:t>
+        <w:tab/>
+        <w:t>2022.01 – 2022.03</w:t>
       </w:r>
     </w:p>
     <w:p>
       <w:pPr>
-        <w:spacing w:before="160" w:after="60" w:line="245" w:lineRule="auto"/>
+        <w:spacing w:before="0" w:after="20" w:line="252" w:lineRule="auto"/>
+        <w:ind w:left="283"/>
+      </w:pPr>
+      <w:r>
+        <w:rPr>
+          <w:rFonts w:ascii="Aptos" w:hAnsi="Aptos" w:eastAsia="Microsoft YaHei"/>
+          <w:b w:val="0"/>
+          <w:i w:val="0"/>
+          <w:color w:val="222222"/>
+          <w:sz w:val="20"/>
+        </w:rPr>
+        <w:t>• Python 结合 tbquant，基于拓扑空间结构距离开发模式识别算法，在股指期货上完成策略开发、回测与参数优化。</w:t>
+      </w:r>
+    </w:p>
+    <w:p>
+      <w:pPr>
+        <w:spacing w:before="160" w:after="60" w:line="252" w:lineRule="auto"/>
         <w:pBdr>
-          <w:bottom w:val="single" w:sz="12" w:space="1" w:color="1F4E79"/>
+          <w:bottom w:val="single" w:sz="6" w:space="2" w:color="1A535C"/>
         </w:pBdr>
       </w:pPr>
       <w:r>
         <w:rPr>
-          <w:rFonts w:ascii="黑体" w:hAnsi="黑体" w:eastAsia="黑体"/>
+          <w:rFonts w:ascii="Aptos" w:hAnsi="Aptos" w:eastAsia="Microsoft YaHei"/>
           <w:b/>
-          <w:color w:val="1F4E79"/>
-          <w:sz w:val="25"/>
+          <w:i w:val="0"/>
+          <w:color w:val="1A535C"/>
+          <w:sz w:val="24"/>
         </w:rPr>
-        <w:t>项目经历</w:t>
-      </w:r>
-    </w:p>
-    <w:tbl>
-      <w:tblPr>
-        <w:tblW w:type="auto" w:w="0"/>
-        <w:tblLayout w:type="autofit"/>
-        <w:tblLook w:firstColumn="1" w:firstRow="1" w:lastColumn="0" w:lastRow="0" w:noHBand="0" w:noVBand="1" w:val="04A0"/>
-        <w:tblBorders>
-          <w:top w:val="nil"/>
-          <w:left w:val="nil"/>
-          <w:bottom w:val="nil"/>
-          <w:right w:val="nil"/>
-          <w:insideH w:val="nil"/>
-          <w:insideV w:val="nil"/>
-        </w:tblBorders>
-      </w:tblPr>
-      <w:tblGrid>
-        <w:gridCol w:w="5046"/>
-        <w:gridCol w:w="5046"/>
-      </w:tblGrid>
-      <w:tr>
-        <w:tc>
-          <w:tcPr>
-            <w:tcW w:type="dxa" w:w="5046"/>
-          </w:tcPr>
-          <w:p>
-            <w:pPr>
-              <w:spacing w:before="60" w:after="20"/>
-            </w:pPr>
-            <w:r/>
-            <w:r>
-              <w:rPr>
-                <w:rFonts w:ascii="黑体" w:hAnsi="黑体" w:eastAsia="黑体"/>
-                <w:b/>
-                <w:color w:val="2D2D2D"/>
-                <w:sz w:val="21"/>
-              </w:rPr>
-              <w:t>股票短线多头策略（掘金）  |  分钟板块因子 + 日线量价</w:t>
-            </w:r>
-          </w:p>
-        </w:tc>
-        <w:tc>
-          <w:tcPr>
-            <w:tcW w:type="dxa" w:w="5046"/>
-          </w:tcPr>
-          <w:p>
-            <w:pPr>
-              <w:spacing w:before="60" w:after="20"/>
-              <w:jc w:val="right"/>
-            </w:pPr>
-            <w:r/>
-            <w:r>
-              <w:rPr>
-                <w:rFonts w:ascii="宋体" w:hAnsi="宋体" w:eastAsia="宋体"/>
-                <w:b w:val="0"/>
-                <w:color w:val="555555"/>
-                <w:sz w:val="20"/>
-              </w:rPr>
-              <w:t>2022.07 – 至今</w:t>
-            </w:r>
-          </w:p>
-        </w:tc>
-      </w:tr>
-    </w:tbl>
-    <w:p>
-      <w:pPr>
-        <w:spacing w:after="40" w:before="0" w:line="259" w:lineRule="auto"/>
-      </w:pPr>
-      <w:r>
-        <w:rPr>
-          <w:rFonts w:ascii="宋体" w:hAnsi="宋体" w:eastAsia="宋体"/>
-          <w:b w:val="0"/>
-          <w:color w:val="2D2D2D"/>
-          <w:sz w:val="20"/>
-        </w:rPr>
-        <w:t>职责：因子挖掘与组合、回测评估、参数优化、实盘版本接入每日更新数据。</w:t>
+        <w:t>教育背景</w:t>
       </w:r>
     </w:p>
     <w:p>
       <w:pPr>
-        <w:pStyle w:val="ListBullet"/>
-        <w:spacing w:after="24" w:before="0" w:line="259" w:lineRule="auto"/>
+        <w:tabs>
+          <w:tab w:pos="9638" w:val="right"/>
+        </w:tabs>
+        <w:spacing w:before="80" w:after="20" w:line="252" w:lineRule="auto"/>
       </w:pPr>
       <w:r>
         <w:rPr>
-          <w:rFonts w:ascii="宋体" w:hAnsi="宋体" w:eastAsia="宋体"/>
+          <w:rFonts w:ascii="Aptos" w:hAnsi="Aptos" w:eastAsia="Microsoft YaHei"/>
+          <w:b/>
+          <w:i w:val="0"/>
+          <w:color w:val="222222"/>
+          <w:sz w:val="20"/>
+        </w:rPr>
+        <w:t>华中科技大学  |  金融学  |  硕士（全日制）</w:t>
+      </w:r>
+      <w:r>
+        <w:rPr>
+          <w:rFonts w:ascii="Aptos" w:hAnsi="Aptos" w:eastAsia="Microsoft YaHei"/>
           <w:b w:val="0"/>
-          <w:sz w:val="21"/>
+          <w:i w:val="0"/>
+          <w:color w:val="5A5A5A"/>
+          <w:sz w:val="20"/>
         </w:rPr>
-        <w:t>用分钟级板块因子刻画短线强度与拥挤度，结合日线量价因子完成择时与选股，形成可回测、可复现的研究流程。</w:t>
+        <w:tab/>
+        <w:t>2017.09 – 2019.06</w:t>
       </w:r>
     </w:p>
     <w:p>
       <w:pPr>
-        <w:pStyle w:val="ListBullet"/>
-        <w:spacing w:after="24" w:before="0" w:line="259" w:lineRule="auto"/>
+        <w:spacing w:before="0" w:after="20" w:line="252" w:lineRule="auto"/>
+        <w:ind w:left="283"/>
       </w:pPr>
       <w:r>
         <w:rPr>
-          <w:rFonts w:ascii="宋体" w:hAnsi="宋体" w:eastAsia="宋体"/>
+          <w:rFonts w:ascii="Aptos" w:hAnsi="Aptos" w:eastAsia="Microsoft YaHei"/>
           <w:b w:val="0"/>
-          <w:sz w:val="21"/>
+          <w:i w:val="0"/>
+          <w:color w:val="222222"/>
+          <w:sz w:val="20"/>
         </w:rPr>
-        <w:t>回测关注收益、回撤、夏普、换手与参数稳健性；样本内最大回撤2%，年化17.14%，夏普比率3.4。</w:t>
+        <w:t>• 主修量化投资、财务报表分析、金融建模与计算、数理统计；考研数学130/150。</w:t>
       </w:r>
     </w:p>
     <w:p>
       <w:pPr>
-        <w:pStyle w:val="ListBullet"/>
-        <w:spacing w:after="24" w:before="0" w:line="259" w:lineRule="auto"/>
+        <w:spacing w:before="0" w:after="20" w:line="252" w:lineRule="auto"/>
+        <w:ind w:left="283"/>
       </w:pPr>
       <w:r>
         <w:rPr>
-          <w:rFonts w:ascii="宋体" w:hAnsi="宋体" w:eastAsia="宋体"/>
+          <w:rFonts w:ascii="Aptos" w:hAnsi="Aptos" w:eastAsia="Microsoft YaHei"/>
           <w:b w:val="0"/>
-          <w:sz w:val="21"/>
+          <w:i w:val="0"/>
+          <w:color w:val="222222"/>
+          <w:sz w:val="20"/>
         </w:rPr>
-        <w:t>编写实盘策略接入掘金日更数据，跟踪信号衰减、滑点与可成交性，持续迭代因子与进出场规则。</w:t>
-      </w:r>
-    </w:p>
-    <w:tbl>
-      <w:tblPr>
-        <w:tblW w:type="auto" w:w="0"/>
-        <w:tblLayout w:type="autofit"/>
-        <w:tblLook w:firstColumn="1" w:firstRow="1" w:lastColumn="0" w:lastRow="0" w:noHBand="0" w:noVBand="1" w:val="04A0"/>
-        <w:tblBorders>
-          <w:top w:val="nil"/>
-          <w:left w:val="nil"/>
-          <w:bottom w:val="nil"/>
-          <w:right w:val="nil"/>
-          <w:insideH w:val="nil"/>
-          <w:insideV w:val="nil"/>
-        </w:tblBorders>
-      </w:tblPr>
-      <w:tblGrid>
-        <w:gridCol w:w="5046"/>
-        <w:gridCol w:w="5046"/>
-      </w:tblGrid>
-      <w:tr>
-        <w:tc>
-          <w:tcPr>
-            <w:tcW w:type="dxa" w:w="5046"/>
-          </w:tcPr>
-          <w:p>
-            <w:pPr>
-              <w:spacing w:before="60" w:after="20"/>
-            </w:pPr>
-            <w:r/>
-            <w:r>
-              <w:rPr>
-                <w:rFonts w:ascii="黑体" w:hAnsi="黑体" w:eastAsia="黑体"/>
-                <w:b/>
-                <w:color w:val="2D2D2D"/>
-                <w:sz w:val="21"/>
-              </w:rPr>
-              <w:t>基本面选股与赛道轮动研究</w:t>
-            </w:r>
-          </w:p>
-        </w:tc>
-        <w:tc>
-          <w:tcPr>
-            <w:tcW w:type="dxa" w:w="5046"/>
-          </w:tcPr>
-          <w:p>
-            <w:pPr>
-              <w:spacing w:before="60" w:after="20"/>
-              <w:jc w:val="right"/>
-            </w:pPr>
-            <w:r/>
-            <w:r>
-              <w:rPr>
-                <w:rFonts w:ascii="宋体" w:hAnsi="宋体" w:eastAsia="宋体"/>
-                <w:b w:val="0"/>
-                <w:color w:val="555555"/>
-                <w:sz w:val="20"/>
-              </w:rPr>
-              <w:t>2024.03 – 至今</w:t>
-            </w:r>
-          </w:p>
-        </w:tc>
-      </w:tr>
-    </w:tbl>
-    <w:p>
-      <w:pPr>
-        <w:pStyle w:val="ListBullet"/>
-        <w:spacing w:after="24" w:before="0" w:line="259" w:lineRule="auto"/>
-      </w:pPr>
-      <w:r>
-        <w:rPr>
-          <w:rFonts w:ascii="宋体" w:hAnsi="宋体" w:eastAsia="宋体"/>
-          <w:b w:val="0"/>
-          <w:sz w:val="21"/>
-        </w:rPr>
-        <w:t>宏观赛道研究、财务选股模型与业绩预告及时性数据相结合，服务多头选股与行业轮动判断。</w:t>
+        <w:t>• 论文：《医药行业上市公司价值评估研究——以云南白药为例》（股利贴现模型与量化分析）。</w:t>
       </w:r>
     </w:p>
     <w:p>
       <w:pPr>
-        <w:pStyle w:val="ListBullet"/>
-        <w:spacing w:after="24" w:before="0" w:line="259" w:lineRule="auto"/>
+        <w:tabs>
+          <w:tab w:pos="9638" w:val="right"/>
+        </w:tabs>
+        <w:spacing w:before="80" w:after="20" w:line="252" w:lineRule="auto"/>
       </w:pPr>
       <w:r>
         <w:rPr>
-          <w:rFonts w:ascii="宋体" w:hAnsi="宋体" w:eastAsia="宋体"/>
-          <w:b w:val="0"/>
-          <w:sz w:val="21"/>
+          <w:rFonts w:ascii="Aptos" w:hAnsi="Aptos" w:eastAsia="Microsoft YaHei"/>
+          <w:b/>
+          <w:i w:val="0"/>
+          <w:color w:val="222222"/>
+          <w:sz w:val="20"/>
         </w:rPr>
-        <w:t>实盘资金加权：2025年年化约60%，2026年截至8月约40%。</w:t>
+        <w:t>武汉科技大学  |  机械工程  |  本科（全日制）</w:t>
       </w:r>
-    </w:p>
-    <w:tbl>
-      <w:tblPr>
-        <w:tblW w:type="auto" w:w="0"/>
-        <w:tblLayout w:type="autofit"/>
-        <w:tblLook w:firstColumn="1" w:firstRow="1" w:lastColumn="0" w:lastRow="0" w:noHBand="0" w:noVBand="1" w:val="04A0"/>
-        <w:tblBorders>
-          <w:top w:val="nil"/>
-          <w:left w:val="nil"/>
-          <w:bottom w:val="nil"/>
-          <w:right w:val="nil"/>
-          <w:insideH w:val="nil"/>
-          <w:insideV w:val="nil"/>
-        </w:tblBorders>
-      </w:tblPr>
-      <w:tblGrid>
-        <w:gridCol w:w="5046"/>
-        <w:gridCol w:w="5046"/>
-      </w:tblGrid>
-      <w:tr>
-        <w:tc>
-          <w:tcPr>
-            <w:tcW w:type="dxa" w:w="5046"/>
-          </w:tcPr>
-          <w:p>
-            <w:pPr>
-              <w:spacing w:before="60" w:after="20"/>
-            </w:pPr>
-            <w:r/>
-            <w:r>
-              <w:rPr>
-                <w:rFonts w:ascii="黑体" w:hAnsi="黑体" w:eastAsia="黑体"/>
-                <w:b/>
-                <w:color w:val="2D2D2D"/>
-                <w:sz w:val="21"/>
-              </w:rPr>
-              <w:t>期货CTA：基于模式识别的股指策略</w:t>
-            </w:r>
-          </w:p>
-        </w:tc>
-        <w:tc>
-          <w:tcPr>
-            <w:tcW w:type="dxa" w:w="5046"/>
-          </w:tcPr>
-          <w:p>
-            <w:pPr>
-              <w:spacing w:before="60" w:after="20"/>
-              <w:jc w:val="right"/>
-            </w:pPr>
-            <w:r/>
-            <w:r>
-              <w:rPr>
-                <w:rFonts w:ascii="宋体" w:hAnsi="宋体" w:eastAsia="宋体"/>
-                <w:b w:val="0"/>
-                <w:color w:val="555555"/>
-                <w:sz w:val="20"/>
-              </w:rPr>
-              <w:t>2022.01 – 2022.03</w:t>
-            </w:r>
-          </w:p>
-        </w:tc>
-      </w:tr>
-    </w:tbl>
-    <w:p>
-      <w:pPr>
-        <w:pStyle w:val="ListBullet"/>
-        <w:spacing w:after="24" w:before="0" w:line="259" w:lineRule="auto"/>
-      </w:pPr>
       <w:r>
         <w:rPr>
-          <w:rFonts w:ascii="宋体" w:hAnsi="宋体" w:eastAsia="宋体"/>
+          <w:rFonts w:ascii="Aptos" w:hAnsi="Aptos" w:eastAsia="Microsoft YaHei"/>
           <w:b w:val="0"/>
-          <w:sz w:val="21"/>
+          <w:i w:val="0"/>
+          <w:color w:val="5A5A5A"/>
+          <w:sz w:val="20"/>
         </w:rPr>
-        <w:t>Python结合tbquant，基于拓扑空间结构距离开发模式识别算法，在股指期货上完成策略开发、回测与参数优化。</w:t>
+        <w:tab/>
+        <w:t>2013.09 – 2017.06</w:t>
       </w:r>
     </w:p>
     <w:p>
       <w:pPr>
-        <w:spacing w:before="160" w:after="60" w:line="245" w:lineRule="auto"/>
+        <w:spacing w:before="160" w:after="60" w:line="252" w:lineRule="auto"/>
         <w:pBdr>
-          <w:bottom w:val="single" w:sz="12" w:space="1" w:color="1F4E79"/>
+          <w:bottom w:val="single" w:sz="6" w:space="2" w:color="1A535C"/>
         </w:pBdr>
       </w:pPr>
       <w:r>
         <w:rPr>
-          <w:rFonts w:ascii="黑体" w:hAnsi="黑体" w:eastAsia="黑体"/>
+          <w:rFonts w:ascii="Aptos" w:hAnsi="Aptos" w:eastAsia="Microsoft YaHei"/>
           <w:b/>
-          <w:color w:val="1F4E79"/>
-          <w:sz w:val="25"/>
-        </w:rPr>
-        <w:t>教育背景</w:t>
-      </w:r>
-    </w:p>
-    <w:tbl>
-      <w:tblPr>
-        <w:tblW w:type="auto" w:w="0"/>
-        <w:tblLayout w:type="autofit"/>
-        <w:tblLook w:firstColumn="1" w:firstRow="1" w:lastColumn="0" w:lastRow="0" w:noHBand="0" w:noVBand="1" w:val="04A0"/>
-        <w:tblBorders>
-          <w:top w:val="nil"/>
-          <w:left w:val="nil"/>
-          <w:bottom w:val="nil"/>
-          <w:right w:val="nil"/>
-          <w:insideH w:val="nil"/>
-          <w:insideV w:val="nil"/>
-        </w:tblBorders>
-      </w:tblPr>
-      <w:tblGrid>
-        <w:gridCol w:w="5046"/>
-        <w:gridCol w:w="5046"/>
-      </w:tblGrid>
-      <w:tr>
-        <w:tc>
-          <w:tcPr>
-            <w:tcW w:type="dxa" w:w="5046"/>
-          </w:tcPr>
-          <w:p>
-            <w:pPr>
-              <w:spacing w:before="60" w:after="20"/>
-            </w:pPr>
-            <w:r/>
-            <w:r>
-              <w:rPr>
-                <w:rFonts w:ascii="黑体" w:hAnsi="黑体" w:eastAsia="黑体"/>
-                <w:b/>
-                <w:color w:val="2D2D2D"/>
-                <w:sz w:val="21"/>
-              </w:rPr>
-              <w:t>华中科技大学  |  金融学  |  硕士（全日制）</w:t>
-            </w:r>
-          </w:p>
-        </w:tc>
-        <w:tc>
-          <w:tcPr>
-            <w:tcW w:type="dxa" w:w="5046"/>
-          </w:tcPr>
-          <w:p>
-            <w:pPr>
-              <w:spacing w:before="60" w:after="20"/>
-              <w:jc w:val="right"/>
-            </w:pPr>
-            <w:r/>
-            <w:r>
-              <w:rPr>
-                <w:rFonts w:ascii="宋体" w:hAnsi="宋体" w:eastAsia="宋体"/>
-                <w:b w:val="0"/>
-                <w:color w:val="555555"/>
-                <w:sz w:val="20"/>
-              </w:rPr>
-              <w:t>2017.09 – 2019.06</w:t>
-            </w:r>
-          </w:p>
-        </w:tc>
-      </w:tr>
-    </w:tbl>
-    <w:p>
-      <w:pPr>
-        <w:pStyle w:val="ListBullet"/>
-        <w:spacing w:after="24" w:before="0" w:line="259" w:lineRule="auto"/>
-      </w:pPr>
-      <w:r>
-        <w:rPr>
-          <w:rFonts w:ascii="宋体" w:hAnsi="宋体" w:eastAsia="宋体"/>
-          <w:b w:val="0"/>
-          <w:sz w:val="21"/>
-        </w:rPr>
-        <w:t>主修量化投资、财务报表分析、金融建模与计算、数理统计；考研数学130/150。</w:t>
-      </w:r>
-    </w:p>
-    <w:p>
-      <w:pPr>
-        <w:pStyle w:val="ListBullet"/>
-        <w:spacing w:after="24" w:before="0" w:line="259" w:lineRule="auto"/>
-      </w:pPr>
-      <w:r>
-        <w:rPr>
-          <w:rFonts w:ascii="宋体" w:hAnsi="宋体" w:eastAsia="宋体"/>
-          <w:b w:val="0"/>
-          <w:sz w:val="21"/>
-        </w:rPr>
-        <w:t>论文：《医药行业上市公司价值评估研究——以云南白药为例》（股利贴现模型与量化分析）。</w:t>
-      </w:r>
-    </w:p>
-    <w:tbl>
-      <w:tblPr>
-        <w:tblW w:type="auto" w:w="0"/>
-        <w:tblLayout w:type="autofit"/>
-        <w:tblLook w:firstColumn="1" w:firstRow="1" w:lastColumn="0" w:lastRow="0" w:noHBand="0" w:noVBand="1" w:val="04A0"/>
-        <w:tblBorders>
-          <w:top w:val="nil"/>
-          <w:left w:val="nil"/>
-          <w:bottom w:val="nil"/>
-          <w:right w:val="nil"/>
-          <w:insideH w:val="nil"/>
-          <w:insideV w:val="nil"/>
-        </w:tblBorders>
-      </w:tblPr>
-      <w:tblGrid>
-        <w:gridCol w:w="5046"/>
-        <w:gridCol w:w="5046"/>
-      </w:tblGrid>
-      <w:tr>
-        <w:tc>
-          <w:tcPr>
-            <w:tcW w:type="dxa" w:w="5046"/>
-          </w:tcPr>
-          <w:p>
-            <w:pPr>
-              <w:spacing w:before="60" w:after="20"/>
-            </w:pPr>
-            <w:r/>
-            <w:r>
-              <w:rPr>
-                <w:rFonts w:ascii="黑体" w:hAnsi="黑体" w:eastAsia="黑体"/>
-                <w:b/>
-                <w:color w:val="2D2D2D"/>
-                <w:sz w:val="21"/>
-              </w:rPr>
-              <w:t>武汉科技大学  |  机械工程  |  本科（全日制）</w:t>
-            </w:r>
-          </w:p>
-        </w:tc>
-        <w:tc>
-          <w:tcPr>
-            <w:tcW w:type="dxa" w:w="5046"/>
-          </w:tcPr>
-          <w:p>
-            <w:pPr>
-              <w:spacing w:before="60" w:after="20"/>
-              <w:jc w:val="right"/>
-            </w:pPr>
-            <w:r/>
-            <w:r>
-              <w:rPr>
-                <w:rFonts w:ascii="宋体" w:hAnsi="宋体" w:eastAsia="宋体"/>
-                <w:b w:val="0"/>
-                <w:color w:val="555555"/>
-                <w:sz w:val="20"/>
-              </w:rPr>
-              <w:t>2013.09 – 2017.06</w:t>
-            </w:r>
-          </w:p>
-        </w:tc>
-      </w:tr>
-    </w:tbl>
-    <w:p>
-      <w:pPr>
-        <w:spacing w:before="160" w:after="60" w:line="245" w:lineRule="auto"/>
-        <w:pBdr>
-          <w:bottom w:val="single" w:sz="12" w:space="1" w:color="1F4E79"/>
-        </w:pBdr>
-      </w:pPr>
-      <w:r>
-        <w:rPr>
-          <w:rFonts w:ascii="黑体" w:hAnsi="黑体" w:eastAsia="黑体"/>
-          <w:b/>
-          <w:color w:val="1F4E79"/>
-          <w:sz w:val="25"/>
+          <w:i w:val="0"/>
+          <w:color w:val="1A535C"/>
+          <w:sz w:val="24"/>
         </w:rPr>
         <w:t>技能与证书</w:t>
       </w:r>
     </w:p>
     <w:p>
       <w:pPr>
-        <w:pStyle w:val="ListBullet"/>
-        <w:spacing w:after="24" w:before="0" w:line="259" w:lineRule="auto"/>
+        <w:spacing w:before="20" w:after="20" w:line="252" w:lineRule="auto"/>
       </w:pPr>
       <w:r>
         <w:rPr>
-          <w:rFonts w:ascii="宋体" w:hAnsi="宋体" w:eastAsia="宋体"/>
+          <w:rFonts w:ascii="Aptos" w:hAnsi="Aptos" w:eastAsia="Microsoft YaHei"/>
+          <w:b/>
+          <w:i w:val="0"/>
+          <w:color w:val="222222"/>
+          <w:sz w:val="20"/>
+        </w:rPr>
+        <w:t>Python：</w:t>
+      </w:r>
+      <w:r>
+        <w:rPr>
+          <w:rFonts w:ascii="Aptos" w:hAnsi="Aptos" w:eastAsia="Microsoft YaHei"/>
           <w:b w:val="0"/>
-          <w:sz w:val="21"/>
+          <w:i w:val="0"/>
+          <w:color w:val="222222"/>
+          <w:sz w:val="20"/>
         </w:rPr>
-        <w:t>Python：Pandas、Numpy、Talib，可独立完成日频与分钟行情、财报截面数据的处理、因子计算、回测与可视化；熟悉Linux服务器环境配置、脚本部署与定时任务。</w:t>
+        <w:t>Pandas、Numpy、Talib；可独立完成日频与分钟行情、财报截面的处理、因子计算、回测与可视化；熟悉 Linux 环境配置、脚本部署与定时任务。</w:t>
       </w:r>
     </w:p>
     <w:p>
       <w:pPr>
-        <w:pStyle w:val="ListBullet"/>
-        <w:spacing w:after="24" w:before="0" w:line="259" w:lineRule="auto"/>
+        <w:spacing w:before="20" w:after="20" w:line="252" w:lineRule="auto"/>
       </w:pPr>
       <w:r>
         <w:rPr>
-          <w:rFonts w:ascii="宋体" w:hAnsi="宋体" w:eastAsia="宋体"/>
+          <w:rFonts w:ascii="Aptos" w:hAnsi="Aptos" w:eastAsia="Microsoft YaHei"/>
+          <w:b/>
+          <w:i w:val="0"/>
+          <w:color w:val="222222"/>
+          <w:sz w:val="20"/>
+        </w:rPr>
+        <w:t>研究工具：</w:t>
+      </w:r>
+      <w:r>
+        <w:rPr>
+          <w:rFonts w:ascii="Aptos" w:hAnsi="Aptos" w:eastAsia="Microsoft YaHei"/>
           <w:b w:val="0"/>
-          <w:sz w:val="21"/>
+          <w:i w:val="0"/>
+          <w:color w:val="222222"/>
+          <w:sz w:val="20"/>
         </w:rPr>
-        <w:t>研究工具：聚宽、掘金、Wind、Stata、MATLAB、Excel；理解未来函数、过拟合与样本外失效等回测陷阱，研究中做参数稳健性与对照检验。</w:t>
+        <w:t>聚宽、掘金、Wind、Stata、MATLAB、Excel；理解未来函数、过拟合与样本外失效，研究中做参数稳健性与对照检验。</w:t>
       </w:r>
     </w:p>
     <w:p>
       <w:pPr>
-        <w:pStyle w:val="ListBullet"/>
-        <w:spacing w:after="24" w:before="0" w:line="259" w:lineRule="auto"/>
+        <w:spacing w:before="20" w:after="20" w:line="252" w:lineRule="auto"/>
       </w:pPr>
       <w:r>
         <w:rPr>
-          <w:rFonts w:ascii="宋体" w:hAnsi="宋体" w:eastAsia="宋体"/>
-          <w:sz w:val="21"/>
+          <w:rFonts w:ascii="Aptos" w:hAnsi="Aptos" w:eastAsia="Microsoft YaHei"/>
+          <w:b/>
+          <w:i w:val="0"/>
+          <w:color w:val="222222"/>
+          <w:sz w:val="20"/>
         </w:rPr>
-        <w:t>AI辅助研发：熟练使用 Claude、Cursor 等 AI 编程工具辅助数据处理、因子与回测代码开发，了解 MCP 用法，提升研究迭代效率。</w:t>
+        <w:t>AI辅助研发：</w:t>
+      </w:r>
+      <w:r>
+        <w:rPr>
+          <w:rFonts w:ascii="Aptos" w:hAnsi="Aptos" w:eastAsia="Microsoft YaHei"/>
+          <w:b w:val="0"/>
+          <w:i w:val="0"/>
+          <w:color w:val="222222"/>
+          <w:sz w:val="20"/>
+        </w:rPr>
+        <w:t>使用 Claude、Cursor 辅助数据处理与回测代码开发，了解 MCP 用法，用于加快研究迭代，不替代研究判断。</w:t>
       </w:r>
     </w:p>
     <w:p>
       <w:pPr>
-        <w:pStyle w:val="ListBullet"/>
-        <w:spacing w:after="24" w:before="0" w:line="259" w:lineRule="auto"/>
+        <w:spacing w:before="20" w:after="20" w:line="252" w:lineRule="auto"/>
       </w:pPr>
       <w:r>
         <w:rPr>
-          <w:rFonts w:ascii="宋体" w:hAnsi="宋体" w:eastAsia="宋体"/>
-          <w:b w:val="0"/>
-          <w:sz w:val="21"/>
+          <w:rFonts w:ascii="Aptos" w:hAnsi="Aptos" w:eastAsia="Microsoft YaHei"/>
+          <w:b/>
+          <w:i w:val="0"/>
+          <w:color w:val="222222"/>
+          <w:sz w:val="20"/>
         </w:rPr>
-        <w:t>证书：证券、基金、银行从业资格，计算机二级；英语六级558，可阅读英文文献。</w:t>
+        <w:t>证书：</w:t>
       </w:r>
-    </w:p>
-    <w:p>
-      <w:pPr>
-        <w:spacing w:before="120"/>
-        <w:jc w:val="right"/>
-      </w:pPr>
       <w:r>
         <w:rPr>
-          <w:rFonts w:ascii="宋体" w:hAnsi="宋体" w:eastAsia="宋体"/>
+          <w:rFonts w:ascii="Aptos" w:hAnsi="Aptos" w:eastAsia="Microsoft YaHei"/>
           <w:b w:val="0"/>
-          <w:color w:val="888888"/>
-          <w:sz w:val="16"/>
+          <w:i w:val="0"/>
+          <w:color w:val="222222"/>
+          <w:sz w:val="20"/>
         </w:rPr>
-        <w:t>针对国联民生证券自营量化研究员岗位优化  |  2026年8月</w:t>
+        <w:t>证券、基金、银行从业资格，计算机二级；英语六级558，可阅读英文文献。</w:t>
       </w:r>
     </w:p>
     <w:sectPr>
-      <w:pgSz w:w="11906" w:h="16838"/>
-      <w:pgMar w:top="709" w:right="907" w:bottom="680" w:left="907" w:header="720" w:footer="720" w:gutter="0"/>
+      <w:pgSz w:w="12240" w:h="15840"/>
+      <w:pgMar w:top="850" w:right="1077" w:bottom="850" w:left="1077" w:header="720" w:footer="720" w:gutter="0"/>
       <w:cols w:space="720"/>
       <w:docGrid w:linePitch="360"/>
     </w:sectPr>
@@ -1666,6 +1377,10 @@
     <w:name w:val="Normal"/>
     <w:qFormat/>
     <w:rsid w:val="00FC693F"/>
+    <w:rPr>
+      <w:rFonts w:ascii="Aptos" w:hAnsi="Aptos"/>
+      <w:sz w:val="20"/>
+    </w:rPr>
   </w:style>
   <w:style w:type="paragraph" w:styleId="Header">
     <w:name w:val="header"/>

</xml_diff>